<commit_message>
Agregando CU restantes y realizando mejoraras
</commit_message>
<xml_diff>
--- a/CU-REVISADOS/CU2_DASHBOARDCLIENTE.docx
+++ b/CU-REVISADOS/CU2_DASHBOARDCLIENTE.docx
@@ -1836,7 +1836,6 @@
         </w:numPr>
         <w:spacing w:after="80" w:line="276" w:lineRule="auto"/>
       </w:pPr>
-      <w:commentRangeStart w:id="1"/>
       <w:r>
         <w:rPr>
           <w:rFonts w:eastAsia="Calibri"/>
@@ -1844,13 +1843,6 @@
           <w:szCs w:val="22"/>
         </w:rPr>
         <w:t>El sistema muestra el mensaje: “Aún no ha registrado ninguna solicitud.”</w:t>
-      </w:r>
-      <w:commentRangeEnd w:id="1"/>
-      <w:r>
-        <w:rPr>
-          <w:rStyle w:val="Refdecomentario"/>
-        </w:rPr>
-        <w:commentReference w:id="1"/>
       </w:r>
     </w:p>
     <w:p>
@@ -1955,31 +1947,7 @@
           <w:sz w:val="22"/>
           <w:szCs w:val="22"/>
         </w:rPr>
-        <w:t xml:space="preserve">El sistema finaliza la sesión y elimina las credenciales de acceso almacenadas en el </w:t>
-      </w:r>
-      <w:commentRangeStart w:id="2"/>
-      <w:r>
-        <w:rPr>
-          <w:rFonts w:eastAsia="Calibri"/>
-          <w:sz w:val="22"/>
-          <w:szCs w:val="22"/>
-        </w:rPr>
-        <w:t>navegador</w:t>
-      </w:r>
-      <w:commentRangeEnd w:id="2"/>
-      <w:r>
-        <w:rPr>
-          <w:rStyle w:val="Refdecomentario"/>
-        </w:rPr>
-        <w:commentReference w:id="2"/>
-      </w:r>
-      <w:r>
-        <w:rPr>
-          <w:rFonts w:eastAsia="Calibri"/>
-          <w:sz w:val="22"/>
-          <w:szCs w:val="22"/>
-        </w:rPr>
-        <w:t>.</w:t>
+        <w:t>El sistema finaliza la sesión y elimina las credenciales de acceso almacenadas en el navegador.</w:t>
       </w:r>
     </w:p>
     <w:p>
@@ -3675,7 +3643,6 @@
                 <w:szCs w:val="20"/>
               </w:rPr>
             </w:pPr>
-            <w:commentRangeStart w:id="3"/>
             <w:r>
               <w:rPr>
                 <w:rFonts w:eastAsia="Calibri"/>
@@ -3683,13 +3650,6 @@
                 <w:szCs w:val="20"/>
               </w:rPr>
               <w:t>Número de boleta</w:t>
-            </w:r>
-            <w:commentRangeEnd w:id="3"/>
-            <w:r>
-              <w:rPr>
-                <w:rStyle w:val="Refdecomentario"/>
-              </w:rPr>
-              <w:commentReference w:id="3"/>
             </w:r>
           </w:p>
         </w:tc>
@@ -4903,7 +4863,6 @@
           <w:szCs w:val="22"/>
         </w:rPr>
       </w:pPr>
-      <w:commentRangeStart w:id="4"/>
       <w:r>
         <w:rPr>
           <w:rFonts w:eastAsia="Calibri"/>
@@ -4913,10 +4872,6 @@
           <w:szCs w:val="22"/>
         </w:rPr>
         <w:t>RN05 Estados de la solicitud</w:t>
-      </w:r>
-      <w:commentRangeEnd w:id="4"/>
-      <w:r>
-        <w:commentReference w:id="4"/>
       </w:r>
     </w:p>
     <w:p>
@@ -5588,6 +5543,9 @@
             <w:r>
               <w:t xml:space="preserve"> </w:t>
             </w:r>
+            <w:r>
+              <w:t>Analista de Procesos</w:t>
+            </w:r>
           </w:p>
         </w:tc>
         <w:tc>
@@ -5601,6 +5559,21 @@
             </w:tcBorders>
           </w:tcPr>
           <w:p>
+            <w:r>
+              <w:rPr>
+                <w:noProof/>
+              </w:rPr>
+              <w:pict w14:anchorId="702EA032">
+                <v:shape id="_x0000_s1027" style="position:absolute;margin-left:2.2pt;margin-top:-.95pt;width:55.25pt;height:16.1pt;z-index:1;mso-position-horizontal-relative:char;mso-position-vertical-relative:line" coordsize="21600,21600" o:spt="100" adj="0,,0" path="" filled="f">
+                  <v:stroke joinstyle="round" endcap="round"/>
+                  <v:formulas/>
+                  <v:path shadowok="f" o:extrusionok="f" fillok="f" insetpenok="f" o:connecttype="segments"/>
+                  <o:lock v:ext="edit" rotation="t" aspectratio="t" verticies="t" text="t" shapetype="t"/>
+                  <o:ink i="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" annotation="t"/>
+                  <w10:wrap anchorx="page" anchory="page"/>
+                </v:shape>
+              </w:pict>
+            </w:r>
             <w:r>
               <w:t xml:space="preserve"> </w:t>
             </w:r>
@@ -5677,150 +5650,6 @@
     </w:sectPr>
   </w:body>
 </w:document>
-</file>
-
-<file path=word/comments.xml><?xml version="1.0" encoding="utf-8"?>
-<w:comments xmlns:wpc="http://schemas.microsoft.com/office/word/2010/wordprocessingCanvas" xmlns:cx="http://schemas.microsoft.com/office/drawing/2014/chartex" xmlns:cx1="http://schemas.microsoft.com/office/drawing/2015/9/8/chartex" xmlns:cx2="http://schemas.microsoft.com/office/drawing/2015/10/21/chartex" xmlns:cx3="http://schemas.microsoft.com/office/drawing/2016/5/9/chartex" xmlns:cx4="http://schemas.microsoft.com/office/drawing/2016/5/10/chartex" xmlns:cx5="http://schemas.microsoft.com/office/drawing/2016/5/11/chartex" xmlns:cx6="http://schemas.microsoft.com/office/drawing/2016/5/12/chartex" xmlns:cx7="http://schemas.microsoft.com/office/drawing/2016/5/13/chartex" xmlns:cx8="http://schemas.microsoft.com/office/drawing/2016/5/14/chartex" xmlns:mc="http://schemas.openxmlformats.org/markup-compatibility/2006" xmlns:aink="http://schemas.microsoft.com/office/drawing/2016/ink" xmlns:am3d="http://schemas.microsoft.com/office/drawing/2017/model3d" xmlns:o="urn:schemas-microsoft-com:office:office" xmlns:r="http://schemas.openxmlformats.org/officeDocument/2006/relationships" xmlns:m="http://schemas.openxmlformats.org/officeDocument/2006/math" xmlns:v="urn:schemas-microsoft-com:vml" xmlns:wp14="http://schemas.microsoft.com/office/word/2010/wordprocessingDrawing" xmlns:wp="http://schemas.openxmlformats.org/drawingml/2006/wordprocessingDrawing" xmlns:w10="urn:schemas-microsoft-com:office:word" xmlns:w="http://schemas.openxmlformats.org/wordprocessingml/2006/main" xmlns:w14="http://schemas.microsoft.com/office/word/2010/wordml" xmlns:w15="http://schemas.microsoft.com/office/word/2012/wordml" xmlns:w16cex="http://schemas.microsoft.com/office/word/2018/wordml/cex" xmlns:w16cid="http://schemas.microsoft.com/office/word/2016/wordml/cid" xmlns:w16="http://schemas.microsoft.com/office/word/2018/wordml" xmlns:w16sdtdh="http://schemas.microsoft.com/office/word/2020/wordml/sdtdatahash" xmlns:w16se="http://schemas.microsoft.com/office/word/2015/wordml/symex" xmlns:wpg="http://schemas.microsoft.com/office/word/2010/wordprocessingGroup" xmlns:wpi="http://schemas.microsoft.com/office/word/2010/wordprocessingInk" xmlns:wne="http://schemas.microsoft.com/office/word/2006/wordml" xmlns:wps="http://schemas.microsoft.com/office/word/2010/wordprocessingShape" mc:Ignorable="w14 w15 w16se w16cid w16 w16cex w16sdtdh wp14">
-  <w:comment w:id="1" w:author="Cindy Beatriz Pú Getellá" w:date="2026-09-10T18:01:00Z" w:initials="CBPG">
-    <w:p>
-      <w:pPr>
-        <w:pStyle w:val="Textocomentario"/>
-      </w:pPr>
-      <w:r>
-        <w:rPr>
-          <w:rStyle w:val="Refdecomentario"/>
-        </w:rPr>
-        <w:annotationRef/>
-      </w:r>
-      <w:r>
-        <w:t xml:space="preserve">Pendiente revisar, en otros usuarios externos no me deja ingresar, solo con </w:t>
-      </w:r>
-      <w:proofErr w:type="spellStart"/>
-      <w:r>
-        <w:t>sofia</w:t>
-      </w:r>
-      <w:proofErr w:type="spellEnd"/>
-      <w:r>
-        <w:t xml:space="preserve"> y </w:t>
-      </w:r>
-      <w:proofErr w:type="spellStart"/>
-      <w:r>
-        <w:t>roberto</w:t>
-      </w:r>
-      <w:proofErr w:type="spellEnd"/>
-    </w:p>
-  </w:comment>
-  <w:comment w:id="2" w:author="Cindy Beatriz Pú Getellá" w:date="2026-09-10T17:44:00Z" w:initials="CBPG">
-    <w:p>
-      <w:pPr>
-        <w:pStyle w:val="Textocomentario"/>
-      </w:pPr>
-      <w:r>
-        <w:rPr>
-          <w:rStyle w:val="Refdecomentario"/>
-        </w:rPr>
-        <w:annotationRef/>
-      </w:r>
-      <w:r>
-        <w:t>¿Porque no tenemos algún botón que nos redirija a el portal?</w:t>
-      </w:r>
-    </w:p>
-  </w:comment>
-  <w:comment w:id="3" w:author="Cindy Beatriz Pú Getellá" w:date="2026-09-09T18:50:00Z" w:initials="CBPG">
-    <w:p>
-      <w:pPr>
-        <w:pStyle w:val="Textocomentario"/>
-      </w:pPr>
-      <w:r>
-        <w:rPr>
-          <w:rStyle w:val="Refdecomentario"/>
-        </w:rPr>
-        <w:annotationRef/>
-      </w:r>
-      <w:r>
-        <w:t xml:space="preserve">Agregar la palabra Numero en el </w:t>
-      </w:r>
-      <w:proofErr w:type="spellStart"/>
-      <w:r>
-        <w:t>front</w:t>
-      </w:r>
-      <w:proofErr w:type="spellEnd"/>
-      <w:r>
-        <w:t xml:space="preserve"> Cari porfis</w:t>
-      </w:r>
-    </w:p>
-  </w:comment>
-  <w:comment w:id="4" w:author="Claude" w:date="2026-09-09T02:00:00Z" w:initials="C">
-    <w:p>
-      <w:r>
-        <w:annotationRef/>
-      </w:r>
-      <w:r>
-        <w:rPr>
-          <w:color w:val="000000"/>
-          <w:sz w:val="20"/>
-          <w:szCs w:val="20"/>
-        </w:rPr>
-        <w:t xml:space="preserve">Faltan los estados restantes. Completar esta tabla con el resultado de: SELECT * FROM </w:t>
-      </w:r>
-      <w:proofErr w:type="spellStart"/>
-      <w:proofErr w:type="gramStart"/>
-      <w:r>
-        <w:rPr>
-          <w:color w:val="000000"/>
-          <w:sz w:val="20"/>
-          <w:szCs w:val="20"/>
-        </w:rPr>
-        <w:t>soltec.estado</w:t>
-      </w:r>
-      <w:proofErr w:type="gramEnd"/>
-      <w:r>
-        <w:rPr>
-          <w:color w:val="000000"/>
-          <w:sz w:val="20"/>
-          <w:szCs w:val="20"/>
-        </w:rPr>
-        <w:t>_caso</w:t>
-      </w:r>
-      <w:proofErr w:type="spellEnd"/>
-      <w:r>
-        <w:rPr>
-          <w:color w:val="000000"/>
-          <w:sz w:val="20"/>
-          <w:szCs w:val="20"/>
-        </w:rPr>
-        <w:t xml:space="preserve"> ORDER BY id; y agregar el color que le corresponde a cada etiqueta.</w:t>
-      </w:r>
-    </w:p>
-  </w:comment>
-</w:comments>
-</file>
-
-<file path=word/commentsExtended.xml><?xml version="1.0" encoding="utf-8"?>
-<w15:commentsEx xmlns:wpc="http://schemas.microsoft.com/office/word/2010/wordprocessingCanvas" xmlns:cx="http://schemas.microsoft.com/office/drawing/2014/chartex" xmlns:cx1="http://schemas.microsoft.com/office/drawing/2015/9/8/chartex" xmlns:cx2="http://schemas.microsoft.com/office/drawing/2015/10/21/chartex" xmlns:cx3="http://schemas.microsoft.com/office/drawing/2016/5/9/chartex" xmlns:cx4="http://schemas.microsoft.com/office/drawing/2016/5/10/chartex" xmlns:cx5="http://schemas.microsoft.com/office/drawing/2016/5/11/chartex" xmlns:cx6="http://schemas.microsoft.com/office/drawing/2016/5/12/chartex" xmlns:cx7="http://schemas.microsoft.com/office/drawing/2016/5/13/chartex" xmlns:cx8="http://schemas.microsoft.com/office/drawing/2016/5/14/chartex" xmlns:mc="http://schemas.openxmlformats.org/markup-compatibility/2006" xmlns:aink="http://schemas.microsoft.com/office/drawing/2016/ink" xmlns:am3d="http://schemas.microsoft.com/office/drawing/2017/model3d" xmlns:o="urn:schemas-microsoft-com:office:office" xmlns:r="http://schemas.openxmlformats.org/officeDocument/2006/relationships" xmlns:m="http://schemas.openxmlformats.org/officeDocument/2006/math" xmlns:v="urn:schemas-microsoft-com:vml" xmlns:wp14="http://schemas.microsoft.com/office/word/2010/wordprocessingDrawing" xmlns:wp="http://schemas.openxmlformats.org/drawingml/2006/wordprocessingDrawing" xmlns:w10="urn:schemas-microsoft-com:office:word" xmlns:w="http://schemas.openxmlformats.org/wordprocessingml/2006/main" xmlns:w14="http://schemas.microsoft.com/office/word/2010/wordml" xmlns:w15="http://schemas.microsoft.com/office/word/2012/wordml" xmlns:w16cex="http://schemas.microsoft.com/office/word/2018/wordml/cex" xmlns:w16cid="http://schemas.microsoft.com/office/word/2016/wordml/cid" xmlns:w16="http://schemas.microsoft.com/office/word/2018/wordml" xmlns:w16sdtdh="http://schemas.microsoft.com/office/word/2020/wordml/sdtdatahash" xmlns:w16se="http://schemas.microsoft.com/office/word/2015/wordml/symex" xmlns:wpg="http://schemas.microsoft.com/office/word/2010/wordprocessingGroup" xmlns:wpi="http://schemas.microsoft.com/office/word/2010/wordprocessingInk" xmlns:wne="http://schemas.microsoft.com/office/word/2006/wordml" xmlns:wps="http://schemas.microsoft.com/office/word/2010/wordprocessingShape" mc:Ignorable="w14 w15 w16se w16cid w16 w16cex w16sdtdh wp14">
-  <w15:commentEx w15:paraId="4D58934B" w15:done="0"/>
-  <w15:commentEx w15:paraId="054644AB" w15:done="0"/>
-  <w15:commentEx w15:paraId="6A0CCC21" w15:done="0"/>
-  <w15:commentEx w15:paraId="5FDB730E" w15:done="0"/>
-</w15:commentsEx>
-</file>
-
-<file path=word/commentsExtensible.xml><?xml version="1.0" encoding="utf-8"?>
-<w16cex:commentsExtensible xmlns:wpc="http://schemas.microsoft.com/office/word/2010/wordprocessingCanvas" xmlns:cx="http://schemas.microsoft.com/office/drawing/2014/chartex" xmlns:cx1="http://schemas.microsoft.com/office/drawing/2015/9/8/chartex" xmlns:cx2="http://schemas.microsoft.com/office/drawing/2015/10/21/chartex" xmlns:cx3="http://schemas.microsoft.com/office/drawing/2016/5/9/chartex" xmlns:cx4="http://schemas.microsoft.com/office/drawing/2016/5/10/chartex" xmlns:cx5="http://schemas.microsoft.com/office/drawing/2016/5/11/chartex" xmlns:cx6="http://schemas.microsoft.com/office/drawing/2016/5/12/chartex" xmlns:cx7="http://schemas.microsoft.com/office/drawing/2016/5/13/chartex" xmlns:cx8="http://schemas.microsoft.com/office/drawing/2016/5/14/chartex" xmlns:mc="http://schemas.openxmlformats.org/markup-compatibility/2006" xmlns:aink="http://schemas.microsoft.com/office/drawing/2016/ink" xmlns:am3d="http://schemas.microsoft.com/office/drawing/2017/model3d" xmlns:o="urn:schemas-microsoft-com:office:office" xmlns:r="http://schemas.openxmlformats.org/officeDocument/2006/relationships" xmlns:m="http://schemas.openxmlformats.org/officeDocument/2006/math" xmlns:v="urn:schemas-microsoft-com:vml" xmlns:wp14="http://schemas.microsoft.com/office/word/2010/wordprocessingDrawing" xmlns:wp="http://schemas.openxmlformats.org/drawingml/2006/wordprocessingDrawing" xmlns:w10="urn:schemas-microsoft-com:office:word" xmlns:w="http://schemas.openxmlformats.org/wordprocessingml/2006/main" xmlns:w14="http://schemas.microsoft.com/office/word/2010/wordml" xmlns:w15="http://schemas.microsoft.com/office/word/2012/wordml" xmlns:w16cex="http://schemas.microsoft.com/office/word/2018/wordml/cex" xmlns:w16cid="http://schemas.microsoft.com/office/word/2016/wordml/cid" xmlns:w16="http://schemas.microsoft.com/office/word/2018/wordml" xmlns:w16sdtdh="http://schemas.microsoft.com/office/word/2020/wordml/sdtdatahash" xmlns:w16se="http://schemas.microsoft.com/office/word/2015/wordml/symex" xmlns:wpg="http://schemas.microsoft.com/office/word/2010/wordprocessingGroup" xmlns:wpi="http://schemas.microsoft.com/office/word/2010/wordprocessingInk" xmlns:wne="http://schemas.microsoft.com/office/word/2006/wordml" xmlns:wps="http://schemas.microsoft.com/office/word/2010/wordprocessingShape" mc:Ignorable="w14 w15 w16se w16cid w16 w16cex w16sdtdh wp14">
-  <w16cex:commentExtensible w16cex:durableId="2E4D6EFE" w16cex:dateUtc="2026-09-11T00:01:00Z"/>
-  <w16cex:commentExtensible w16cex:durableId="2E4D6B19" w16cex:dateUtc="2026-09-10T23:44:00Z"/>
-  <w16cex:commentExtensible w16cex:durableId="2E4C28ED" w16cex:dateUtc="2026-09-10T00:50:00Z"/>
-  <w16cex:commentExtensible w16cex:durableId="7DBD1BD2" w16cex:dateUtc="2026-09-09T02:00:00Z"/>
-</w16cex:commentsExtensible>
-</file>
-
-<file path=word/commentsIds.xml><?xml version="1.0" encoding="utf-8"?>
-<w16cid:commentsIds xmlns:wpc="http://schemas.microsoft.com/office/word/2010/wordprocessingCanvas" xmlns:cx="http://schemas.microsoft.com/office/drawing/2014/chartex" xmlns:cx1="http://schemas.microsoft.com/office/drawing/2015/9/8/chartex" xmlns:cx2="http://schemas.microsoft.com/office/drawing/2015/10/21/chartex" xmlns:cx3="http://schemas.microsoft.com/office/drawing/2016/5/9/chartex" xmlns:cx4="http://schemas.microsoft.com/office/drawing/2016/5/10/chartex" xmlns:cx5="http://schemas.microsoft.com/office/drawing/2016/5/11/chartex" xmlns:cx6="http://schemas.microsoft.com/office/drawing/2016/5/12/chartex" xmlns:cx7="http://schemas.microsoft.com/office/drawing/2016/5/13/chartex" xmlns:cx8="http://schemas.microsoft.com/office/drawing/2016/5/14/chartex" xmlns:mc="http://schemas.openxmlformats.org/markup-compatibility/2006" xmlns:aink="http://schemas.microsoft.com/office/drawing/2016/ink" xmlns:am3d="http://schemas.microsoft.com/office/drawing/2017/model3d" xmlns:o="urn:schemas-microsoft-com:office:office" xmlns:r="http://schemas.openxmlformats.org/officeDocument/2006/relationships" xmlns:m="http://schemas.openxmlformats.org/officeDocument/2006/math" xmlns:v="urn:schemas-microsoft-com:vml" xmlns:wp14="http://schemas.microsoft.com/office/word/2010/wordprocessingDrawing" xmlns:wp="http://schemas.openxmlformats.org/drawingml/2006/wordprocessingDrawing" xmlns:w10="urn:schemas-microsoft-com:office:word" xmlns:w="http://schemas.openxmlformats.org/wordprocessingml/2006/main" xmlns:w14="http://schemas.microsoft.com/office/word/2010/wordml" xmlns:w15="http://schemas.microsoft.com/office/word/2012/wordml" xmlns:w16cex="http://schemas.microsoft.com/office/word/2018/wordml/cex" xmlns:w16cid="http://schemas.microsoft.com/office/word/2016/wordml/cid" xmlns:w16="http://schemas.microsoft.com/office/word/2018/wordml" xmlns:w16sdtdh="http://schemas.microsoft.com/office/word/2020/wordml/sdtdatahash" xmlns:w16se="http://schemas.microsoft.com/office/word/2015/wordml/symex" xmlns:wpg="http://schemas.microsoft.com/office/word/2010/wordprocessingGroup" xmlns:wpi="http://schemas.microsoft.com/office/word/2010/wordprocessingInk" xmlns:wne="http://schemas.microsoft.com/office/word/2006/wordml" xmlns:wps="http://schemas.microsoft.com/office/word/2010/wordprocessingShape" mc:Ignorable="w14 w15 w16se w16cid w16 w16cex w16sdtdh wp14">
-  <w16cid:commentId w16cid:paraId="4D58934B" w16cid:durableId="2E4D6EFE"/>
-  <w16cid:commentId w16cid:paraId="054644AB" w16cid:durableId="2E4D6B19"/>
-  <w16cid:commentId w16cid:paraId="6A0CCC21" w16cid:durableId="2E4C28ED"/>
-  <w16cid:commentId w16cid:paraId="5FDB730E" w16cid:durableId="7DBD1BD2"/>
-</w16cid:commentsIds>
 </file>
 
 <file path=word/numbering.xml><?xml version="1.0" encoding="utf-8"?>
@@ -6665,14 +6494,6 @@
     </w:lvlOverride>
   </w:num>
 </w:numbering>
-</file>
-
-<file path=word/people.xml><?xml version="1.0" encoding="utf-8"?>
-<w15:people xmlns:wpc="http://schemas.microsoft.com/office/word/2010/wordprocessingCanvas" xmlns:cx="http://schemas.microsoft.com/office/drawing/2014/chartex" xmlns:cx1="http://schemas.microsoft.com/office/drawing/2015/9/8/chartex" xmlns:cx2="http://schemas.microsoft.com/office/drawing/2015/10/21/chartex" xmlns:cx3="http://schemas.microsoft.com/office/drawing/2016/5/9/chartex" xmlns:cx4="http://schemas.microsoft.com/office/drawing/2016/5/10/chartex" xmlns:cx5="http://schemas.microsoft.com/office/drawing/2016/5/11/chartex" xmlns:cx6="http://schemas.microsoft.com/office/drawing/2016/5/12/chartex" xmlns:cx7="http://schemas.microsoft.com/office/drawing/2016/5/13/chartex" xmlns:cx8="http://schemas.microsoft.com/office/drawing/2016/5/14/chartex" xmlns:mc="http://schemas.openxmlformats.org/markup-compatibility/2006" xmlns:aink="http://schemas.microsoft.com/office/drawing/2016/ink" xmlns:am3d="http://schemas.microsoft.com/office/drawing/2017/model3d" xmlns:o="urn:schemas-microsoft-com:office:office" xmlns:r="http://schemas.openxmlformats.org/officeDocument/2006/relationships" xmlns:m="http://schemas.openxmlformats.org/officeDocument/2006/math" xmlns:v="urn:schemas-microsoft-com:vml" xmlns:wp14="http://schemas.microsoft.com/office/word/2010/wordprocessingDrawing" xmlns:wp="http://schemas.openxmlformats.org/drawingml/2006/wordprocessingDrawing" xmlns:w10="urn:schemas-microsoft-com:office:word" xmlns:w="http://schemas.openxmlformats.org/wordprocessingml/2006/main" xmlns:w14="http://schemas.microsoft.com/office/word/2010/wordml" xmlns:w15="http://schemas.microsoft.com/office/word/2012/wordml" xmlns:w16cex="http://schemas.microsoft.com/office/word/2018/wordml/cex" xmlns:w16cid="http://schemas.microsoft.com/office/word/2016/wordml/cid" xmlns:w16="http://schemas.microsoft.com/office/word/2018/wordml" xmlns:w16sdtdh="http://schemas.microsoft.com/office/word/2020/wordml/sdtdatahash" xmlns:w16se="http://schemas.microsoft.com/office/word/2015/wordml/symex" xmlns:wpg="http://schemas.microsoft.com/office/word/2010/wordprocessingGroup" xmlns:wpi="http://schemas.microsoft.com/office/word/2010/wordprocessingInk" xmlns:wne="http://schemas.microsoft.com/office/word/2006/wordml" xmlns:wps="http://schemas.microsoft.com/office/word/2010/wordprocessingShape" mc:Ignorable="w14 w15 w16se w16cid w16 w16cex w16sdtdh wp14">
-  <w15:person w15:author="Cindy Beatriz Pú Getellá">
-    <w15:presenceInfo w15:providerId="Windows Live" w15:userId="3896e1f685aa4acb"/>
-  </w15:person>
-</w15:people>
 </file>
 
 <file path=word/styles.xml><?xml version="1.0" encoding="utf-8"?>

</xml_diff>